<commit_message>
[20250902] Material clase 04
</commit_message>
<xml_diff>
--- a/03_Tareas/Tarea 01/Tarea 01.docx
+++ b/03_Tareas/Tarea 01/Tarea 01.docx
@@ -245,137 +245,115 @@
     </w:p>
     <w:p>
       <w:pPr>
-        <w:jc w:val="both"/>
-        <w:rPr>
-          <w:rFonts w:ascii="Segoe UI" w:hAnsi="Segoe UI" w:cs="Segoe UI"/>
-          <w:color w:val="000000"/>
-          <w:sz w:val="20"/>
-          <w:szCs w:val="20"/>
-        </w:rPr>
-      </w:pPr>
-      <w:r>
-        <w:rPr>
-          <w:rFonts w:ascii="Segoe UI" w:hAnsi="Segoe UI" w:cs="Segoe UI"/>
-          <w:color w:val="000000"/>
-          <w:sz w:val="20"/>
-          <w:szCs w:val="20"/>
-        </w:rPr>
-        <w:t>Redacta un</w:t>
-      </w:r>
-      <w:r>
-        <w:rPr>
-          <w:rStyle w:val="apple-converted-space"/>
-          <w:rFonts w:ascii="Segoe UI" w:hAnsi="Segoe UI" w:cs="Segoe UI"/>
-          <w:color w:val="000000"/>
-          <w:sz w:val="20"/>
-          <w:szCs w:val="20"/>
-        </w:rPr>
-        <w:t> </w:t>
-      </w:r>
-      <w:r>
-        <w:rPr>
-          <w:rStyle w:val="Textoennegrita"/>
-          <w:rFonts w:ascii="Segoe UI" w:hAnsi="Segoe UI" w:cs="Segoe UI"/>
-          <w:color w:val="000000"/>
-          <w:sz w:val="20"/>
-          <w:szCs w:val="20"/>
-        </w:rPr>
-        <w:t>prompt maestro</w:t>
-      </w:r>
-      <w:r>
-        <w:rPr>
-          <w:rStyle w:val="apple-converted-space"/>
-          <w:rFonts w:ascii="Segoe UI" w:hAnsi="Segoe UI" w:cs="Segoe UI"/>
-          <w:color w:val="000000"/>
-          <w:sz w:val="20"/>
-          <w:szCs w:val="20"/>
-        </w:rPr>
-        <w:t> </w:t>
-      </w:r>
-      <w:r>
-        <w:rPr>
-          <w:rFonts w:ascii="Segoe UI" w:hAnsi="Segoe UI" w:cs="Segoe UI"/>
-          <w:color w:val="000000"/>
-          <w:sz w:val="20"/>
-          <w:szCs w:val="20"/>
-        </w:rPr>
-        <w:t>que permita obtener un</w:t>
-      </w:r>
-      <w:r>
-        <w:rPr>
-          <w:rStyle w:val="apple-converted-space"/>
-          <w:rFonts w:ascii="Segoe UI" w:hAnsi="Segoe UI" w:cs="Segoe UI"/>
-          <w:color w:val="000000"/>
-          <w:sz w:val="20"/>
-          <w:szCs w:val="20"/>
-        </w:rPr>
-        <w:t> </w:t>
-      </w:r>
-      <w:r>
-        <w:rPr>
-          <w:rStyle w:val="Textoennegrita"/>
-          <w:rFonts w:ascii="Segoe UI" w:hAnsi="Segoe UI" w:cs="Segoe UI"/>
-          <w:color w:val="000000"/>
-          <w:sz w:val="20"/>
-          <w:szCs w:val="20"/>
-        </w:rPr>
-        <w:t>reporte completo</w:t>
-      </w:r>
-      <w:r>
-        <w:rPr>
-          <w:rStyle w:val="apple-converted-space"/>
-          <w:rFonts w:ascii="Segoe UI" w:hAnsi="Segoe UI" w:cs="Segoe UI"/>
-          <w:color w:val="000000"/>
-          <w:sz w:val="20"/>
-          <w:szCs w:val="20"/>
-        </w:rPr>
-        <w:t> </w:t>
-      </w:r>
-      <w:r>
-        <w:rPr>
-          <w:rFonts w:ascii="Segoe UI" w:hAnsi="Segoe UI" w:cs="Segoe UI"/>
-          <w:color w:val="000000"/>
-          <w:sz w:val="20"/>
-          <w:szCs w:val="20"/>
-        </w:rPr>
-        <w:t>sobre el reto que trabajaremos durante el semestre.</w:t>
-      </w:r>
-    </w:p>
-    <w:p>
-      <w:pPr>
-        <w:pStyle w:val="NormalWeb"/>
-        <w:rPr>
-          <w:rFonts w:ascii="Segoe UI" w:hAnsi="Segoe UI" w:cs="Segoe UI"/>
-          <w:color w:val="000000"/>
-          <w:sz w:val="20"/>
-          <w:szCs w:val="20"/>
-        </w:rPr>
-      </w:pPr>
-      <w:r>
-        <w:rPr>
-          <w:rStyle w:val="Textoennegrita"/>
-          <w:rFonts w:ascii="Segoe UI" w:eastAsiaTheme="majorEastAsia" w:hAnsi="Segoe UI" w:cs="Segoe UI"/>
-          <w:color w:val="000000"/>
-          <w:sz w:val="20"/>
-          <w:szCs w:val="20"/>
-        </w:rPr>
-        <w:t>Requisitos del prompt</w:t>
-      </w:r>
-    </w:p>
-    <w:p>
-      <w:pPr>
-        <w:pStyle w:val="NormalWeb"/>
+        <w:pStyle w:val="Prrafodelista"/>
         <w:numPr>
           <w:ilvl w:val="0"/>
           <w:numId w:val="9"/>
         </w:numPr>
-        <w:rPr>
-          <w:rFonts w:ascii="Segoe UI" w:hAnsi="Segoe UI" w:cs="Segoe UI"/>
-          <w:color w:val="000000"/>
-          <w:sz w:val="20"/>
-          <w:szCs w:val="20"/>
-        </w:rPr>
-      </w:pPr>
+        <w:jc w:val="both"/>
+        <w:rPr>
+          <w:rFonts w:ascii="Segoe UI" w:hAnsi="Segoe UI" w:cs="Segoe UI"/>
+          <w:color w:val="000000"/>
+          <w:sz w:val="20"/>
+          <w:szCs w:val="20"/>
+        </w:rPr>
+      </w:pPr>
+      <w:r>
+        <w:rPr>
+          <w:rFonts w:ascii="Segoe UI" w:hAnsi="Segoe UI" w:cs="Segoe UI"/>
+          <w:color w:val="000000"/>
+          <w:sz w:val="20"/>
+          <w:szCs w:val="20"/>
+        </w:rPr>
+        <w:t>Redacta un</w:t>
+      </w:r>
+      <w:r>
+        <w:rPr>
+          <w:rStyle w:val="apple-converted-space"/>
+          <w:rFonts w:ascii="Segoe UI" w:hAnsi="Segoe UI" w:cs="Segoe UI"/>
+          <w:color w:val="000000"/>
+          <w:sz w:val="20"/>
+          <w:szCs w:val="20"/>
+        </w:rPr>
+        <w:t> </w:t>
+      </w:r>
+      <w:r>
+        <w:rPr>
+          <w:rStyle w:val="Textoennegrita"/>
+          <w:rFonts w:ascii="Segoe UI" w:hAnsi="Segoe UI" w:cs="Segoe UI"/>
+          <w:color w:val="000000"/>
+          <w:sz w:val="20"/>
+          <w:szCs w:val="20"/>
+        </w:rPr>
+        <w:t>prompt maestro</w:t>
+      </w:r>
+      <w:r>
+        <w:rPr>
+          <w:rStyle w:val="apple-converted-space"/>
+          <w:rFonts w:ascii="Segoe UI" w:hAnsi="Segoe UI" w:cs="Segoe UI"/>
+          <w:color w:val="000000"/>
+          <w:sz w:val="20"/>
+          <w:szCs w:val="20"/>
+        </w:rPr>
+        <w:t> </w:t>
+      </w:r>
+      <w:r>
+        <w:rPr>
+          <w:rFonts w:ascii="Segoe UI" w:hAnsi="Segoe UI" w:cs="Segoe UI"/>
+          <w:color w:val="000000"/>
+          <w:sz w:val="20"/>
+          <w:szCs w:val="20"/>
+        </w:rPr>
+        <w:t>que permita obtener un</w:t>
+      </w:r>
+      <w:r>
+        <w:rPr>
+          <w:rStyle w:val="apple-converted-space"/>
+          <w:rFonts w:ascii="Segoe UI" w:hAnsi="Segoe UI" w:cs="Segoe UI"/>
+          <w:color w:val="000000"/>
+          <w:sz w:val="20"/>
+          <w:szCs w:val="20"/>
+        </w:rPr>
+        <w:t> </w:t>
+      </w:r>
+      <w:r>
+        <w:rPr>
+          <w:rStyle w:val="Textoennegrita"/>
+          <w:rFonts w:ascii="Segoe UI" w:hAnsi="Segoe UI" w:cs="Segoe UI"/>
+          <w:color w:val="000000"/>
+          <w:sz w:val="20"/>
+          <w:szCs w:val="20"/>
+        </w:rPr>
+        <w:t>reporte completo</w:t>
+      </w:r>
+      <w:r>
+        <w:rPr>
+          <w:rStyle w:val="apple-converted-space"/>
+          <w:rFonts w:ascii="Segoe UI" w:hAnsi="Segoe UI" w:cs="Segoe UI"/>
+          <w:color w:val="000000"/>
+          <w:sz w:val="20"/>
+          <w:szCs w:val="20"/>
+        </w:rPr>
+        <w:t> </w:t>
+      </w:r>
+      <w:r>
+        <w:rPr>
+          <w:rFonts w:ascii="Segoe UI" w:hAnsi="Segoe UI" w:cs="Segoe UI"/>
+          <w:color w:val="000000"/>
+          <w:sz w:val="20"/>
+          <w:szCs w:val="20"/>
+        </w:rPr>
+        <w:t>sobre el reto que trabajaremos durante el semestre.</w:t>
+      </w:r>
+      <w:r>
+        <w:rPr>
+          <w:rFonts w:ascii="Segoe UI" w:hAnsi="Segoe UI" w:cs="Segoe UI"/>
+          <w:color w:val="000000"/>
+          <w:sz w:val="20"/>
+          <w:szCs w:val="20"/>
+        </w:rPr>
+        <w:t xml:space="preserve"> </w:t>
+      </w:r>
       <w:r>
         <w:rPr>
           <w:rFonts w:ascii="Segoe UI" w:hAnsi="Segoe UI" w:cs="Segoe UI"/>
@@ -499,26 +477,32 @@
           <w:sz w:val="20"/>
           <w:szCs w:val="20"/>
         </w:rPr>
-        <w:t>.</w:t>
-      </w:r>
-      <w:r>
-        <w:rPr>
-          <w:rFonts w:ascii="Segoe UI" w:hAnsi="Segoe UI" w:cs="Segoe UI"/>
-          <w:color w:val="000000"/>
-          <w:sz w:val="20"/>
-          <w:szCs w:val="20"/>
-        </w:rPr>
-        <w:br/>
+        <w:t xml:space="preserve">. </w:t>
+      </w:r>
+      <w:r>
+        <w:rPr>
+          <w:rFonts w:ascii="Segoe UI" w:hAnsi="Segoe UI" w:cs="Segoe UI"/>
+          <w:color w:val="000000"/>
+          <w:sz w:val="20"/>
+          <w:szCs w:val="20"/>
+        </w:rPr>
         <w:t>Puedes agregar elementos secundarios útiles (audiencia, estructura de salida, tono, criterios de calidad, formato de referencias, etc.).</w:t>
       </w:r>
     </w:p>
     <w:p>
       <w:pPr>
-        <w:pStyle w:val="NormalWeb"/>
-        <w:numPr>
-          <w:ilvl w:val="0"/>
-          <w:numId w:val="9"/>
-        </w:numPr>
+        <w:jc w:val="both"/>
+        <w:rPr>
+          <w:rFonts w:ascii="Segoe UI" w:hAnsi="Segoe UI" w:cs="Segoe UI"/>
+          <w:color w:val="000000"/>
+          <w:sz w:val="20"/>
+          <w:szCs w:val="20"/>
+        </w:rPr>
+      </w:pPr>
+    </w:p>
+    <w:p>
+      <w:pPr>
+        <w:jc w:val="both"/>
         <w:rPr>
           <w:rFonts w:ascii="Segoe UI" w:hAnsi="Segoe UI" w:cs="Segoe UI"/>
           <w:color w:val="000000"/>
@@ -1717,40 +1701,62 @@
           <w:szCs w:val="20"/>
           <w:lang w:val="es-ES_tradnl"/>
         </w:rPr>
+        <w:t xml:space="preserve">Tome en cuenta lo siguiente: </w:t>
+      </w:r>
+    </w:p>
+    <w:p>
+      <w:pPr>
+        <w:jc w:val="both"/>
+        <w:rPr>
+          <w:rFonts w:ascii="Segoe UI" w:hAnsi="Segoe UI" w:cs="Segoe UI"/>
+          <w:b/>
+          <w:bCs/>
+          <w:sz w:val="20"/>
+          <w:szCs w:val="20"/>
+          <w:lang w:val="es-ES_tradnl"/>
+        </w:rPr>
+      </w:pPr>
+    </w:p>
+    <w:p>
+      <w:pPr>
+        <w:spacing w:before="100" w:beforeAutospacing="1" w:after="100" w:afterAutospacing="1"/>
+        <w:rPr>
+          <w:rFonts w:ascii="Lato" w:hAnsi="Lato"/>
+          <w:color w:val="273540"/>
+        </w:rPr>
+      </w:pPr>
+      <w:r>
+        <w:rPr>
+          <w:rFonts w:ascii="Lato" w:hAnsi="Lato"/>
+          <w:color w:val="273540"/>
+        </w:rPr>
         <w:lastRenderedPageBreak/>
-        <w:t xml:space="preserve">Tome en cuenta lo siguiente: </w:t>
-      </w:r>
-    </w:p>
-    <w:p>
-      <w:pPr>
-        <w:pStyle w:val="Prrafodelista"/>
-        <w:numPr>
-          <w:ilvl w:val="0"/>
-          <w:numId w:val="6"/>
-        </w:numPr>
+        <w:t>Es posible que el LLM haga referencia a librerías que aún no ha instalado. Por favor, instale aquellas librerías que le hagan falta y que sean necesarias.</w:t>
+      </w:r>
+    </w:p>
+    <w:p>
+      <w:pPr>
+        <w:spacing w:before="100" w:beforeAutospacing="1" w:after="100" w:afterAutospacing="1"/>
+        <w:rPr>
+          <w:rFonts w:ascii="Lato" w:hAnsi="Lato"/>
+          <w:color w:val="273540"/>
+        </w:rPr>
+      </w:pPr>
+      <w:r>
+        <w:rPr>
+          <w:rFonts w:ascii="Lato" w:hAnsi="Lato"/>
+          <w:color w:val="273540"/>
+        </w:rPr>
+        <w:t>Es posible que no logres generar un código que te permita resolver este problema (algo que podría depender del LLM que utilices). En ese caso, documenta todos los pasos que seguiste y la respuesta que lograste conseguir.</w:t>
+      </w:r>
+    </w:p>
+    <w:p>
+      <w:pPr>
         <w:jc w:val="both"/>
         <w:rPr>
           <w:rFonts w:ascii="Segoe UI" w:hAnsi="Segoe UI" w:cs="Segoe UI"/>
-          <w:sz w:val="20"/>
-          <w:szCs w:val="20"/>
-          <w:lang w:val="es-ES_tradnl"/>
-        </w:rPr>
-      </w:pPr>
-      <w:r>
-        <w:rPr>
-          <w:rFonts w:ascii="Segoe UI" w:hAnsi="Segoe UI" w:cs="Segoe UI"/>
-          <w:sz w:val="20"/>
-          <w:szCs w:val="20"/>
-          <w:lang w:val="es-ES_tradnl"/>
-        </w:rPr>
-        <w:t xml:space="preserve">Es posible que el LLM haga referencia a librerías que aún no ha instalado. Por favor, instale aquellas librerías que sean necesarias. </w:t>
-      </w:r>
-    </w:p>
-    <w:p>
-      <w:pPr>
-        <w:jc w:val="both"/>
-        <w:rPr>
-          <w:rFonts w:ascii="Segoe UI" w:hAnsi="Segoe UI" w:cs="Segoe UI"/>
+          <w:b/>
+          <w:bCs/>
           <w:sz w:val="20"/>
           <w:szCs w:val="20"/>
           <w:lang w:val="es-ES_tradnl"/>
@@ -2625,7 +2631,25 @@
           <w:szCs w:val="20"/>
           <w:lang w:val="es-ES_tradnl"/>
         </w:rPr>
-        <w:t xml:space="preserve">te quedes con las proyecciones de población a 2030 ordenadas de mayor a menor. ¿Cuál es el estado más poblado? ¿Cuál es el menos poblado? Elimina de esa tabla al dato nacional. </w:t>
+        <w:t xml:space="preserve">te quedes con las proyecciones de población </w:t>
+      </w:r>
+      <w:r>
+        <w:rPr>
+          <w:rFonts w:ascii="Segoe UI" w:hAnsi="Segoe UI" w:cs="Segoe UI"/>
+          <w:sz w:val="20"/>
+          <w:szCs w:val="20"/>
+          <w:lang w:val="es-ES_tradnl"/>
+        </w:rPr>
+        <w:t>de</w:t>
+      </w:r>
+      <w:r>
+        <w:rPr>
+          <w:rFonts w:ascii="Segoe UI" w:hAnsi="Segoe UI" w:cs="Segoe UI"/>
+          <w:sz w:val="20"/>
+          <w:szCs w:val="20"/>
+          <w:lang w:val="es-ES_tradnl"/>
+        </w:rPr>
+        <w:t xml:space="preserve"> 2030 ordenadas de mayor a menor. ¿Cuál es el estado más poblado? ¿Cuál es el menos poblado? Elimina de esa tabla al dato nacional. </w:t>
       </w:r>
     </w:p>
     <w:p>
@@ -2709,6 +2733,15 @@
         </w:rPr>
         <w:t xml:space="preserve"> donde coloques, para todos los estados, el valor de la proyección de la población nacional. </w:t>
       </w:r>
+      <w:r>
+        <w:rPr>
+          <w:rFonts w:ascii="Segoe UI" w:hAnsi="Segoe UI" w:cs="Segoe UI"/>
+          <w:sz w:val="20"/>
+          <w:szCs w:val="20"/>
+          <w:lang w:val="es-ES_tradnl"/>
+        </w:rPr>
+        <w:t>Esto será de utilidad para la siguiente pregunta.</w:t>
+      </w:r>
     </w:p>
     <w:p>
       <w:pPr>
@@ -2796,6 +2829,7 @@
           <w:szCs w:val="20"/>
           <w:lang w:val="es-ES_tradnl"/>
         </w:rPr>
+        <w:lastRenderedPageBreak/>
         <w:t>[</w:t>
       </w:r>
       <w:proofErr w:type="spellStart"/>
@@ -2849,7 +2883,25 @@
           <w:szCs w:val="20"/>
           <w:lang w:val="es-ES_tradnl"/>
         </w:rPr>
-        <w:t xml:space="preserve"> == 30) y determina cual es el año en el que alcanza su mayor población. Repite esto para otra entidad. </w:t>
+        <w:t xml:space="preserve"> == 30) y determina cual es el año en el que alcanza su mayor población. Repite esto para otra entidad</w:t>
+      </w:r>
+      <w:r>
+        <w:rPr>
+          <w:rFonts w:ascii="Segoe UI" w:hAnsi="Segoe UI" w:cs="Segoe UI"/>
+          <w:sz w:val="20"/>
+          <w:szCs w:val="20"/>
+          <w:lang w:val="es-ES_tradnl"/>
+        </w:rPr>
+        <w:t xml:space="preserve"> de tu elección</w:t>
+      </w:r>
+      <w:r>
+        <w:rPr>
+          <w:rFonts w:ascii="Segoe UI" w:hAnsi="Segoe UI" w:cs="Segoe UI"/>
+          <w:sz w:val="20"/>
+          <w:szCs w:val="20"/>
+          <w:lang w:val="es-ES_tradnl"/>
+        </w:rPr>
+        <w:t xml:space="preserve">. </w:t>
       </w:r>
     </w:p>
     <w:p>
@@ -2928,42 +2980,10 @@
       </w:r>
       <w:r>
         <w:rPr>
-          <w:rFonts w:ascii="Segoe UI" w:hAnsi="Segoe UI" w:cs="Segoe UI"/>
-          <w:sz w:val="20"/>
-          <w:szCs w:val="20"/>
-          <w:lang w:val="es-ES_tradnl"/>
-        </w:rPr>
-        <w:t xml:space="preserve">Agrupa la tabla utilizando la variable de entidad. Con el </w:t>
-      </w:r>
-      <w:proofErr w:type="spellStart"/>
-      <w:r>
-        <w:rPr>
-          <w:rFonts w:ascii="Segoe UI" w:hAnsi="Segoe UI" w:cs="Segoe UI"/>
-          <w:sz w:val="20"/>
-          <w:szCs w:val="20"/>
-          <w:lang w:val="es-ES_tradnl"/>
-        </w:rPr>
-        <w:t>filter</w:t>
-      </w:r>
-      <w:proofErr w:type="spellEnd"/>
-      <w:r>
-        <w:rPr>
-          <w:rFonts w:ascii="Segoe UI" w:hAnsi="Segoe UI" w:cs="Segoe UI"/>
-          <w:sz w:val="20"/>
-          <w:szCs w:val="20"/>
-          <w:lang w:val="es-ES_tradnl"/>
-        </w:rPr>
-        <w:t xml:space="preserve">, quédate con el renglón que tiene el valor de población más alto para cada entidad. ¿En que año alcanzan </w:t>
-      </w:r>
-      <w:r>
-        <w:rPr>
-          <w:rFonts w:ascii="Segoe UI" w:hAnsi="Segoe UI" w:cs="Segoe UI"/>
-          <w:sz w:val="20"/>
-          <w:szCs w:val="20"/>
-          <w:lang w:val="es-ES_tradnl"/>
-        </w:rPr>
-        <w:lastRenderedPageBreak/>
-        <w:t xml:space="preserve">su pico poblacional los estados que lo alcanzan antes? ¿En qué año lo alcanzan los que lo alcanzan al final? </w:t>
+          <w:rFonts w:ascii="Lato" w:hAnsi="Lato"/>
+          <w:color w:val="273540"/>
+        </w:rPr>
+        <w:t>Agrupa la tabla utilizando la variable de entidad. Con el filter, quédate con el renglón que tiene el valor de población más alto para cada entidad a lo largo de todos los años de la tabla de datos. ¿En que año alcanzan su pico poblacional los estados de la república? Responde con una tabla o con una gráfica que me permita ver los datos de todos los estados.</w:t>
       </w:r>
     </w:p>
     <w:p>
@@ -2979,127 +2999,354 @@
     </w:p>
     <w:p>
       <w:pPr>
-        <w:jc w:val="both"/>
-        <w:rPr>
-          <w:rFonts w:ascii="Segoe UI" w:hAnsi="Segoe UI" w:cs="Segoe UI"/>
+        <w:pStyle w:val="NormalWeb"/>
+        <w:spacing w:before="180" w:beforeAutospacing="0" w:after="180" w:afterAutospacing="0"/>
+        <w:rPr>
+          <w:rFonts w:ascii="Lato" w:hAnsi="Lato"/>
+          <w:color w:val="273540"/>
+        </w:rPr>
+      </w:pPr>
+      <w:r>
+        <w:rPr>
+          <w:rStyle w:val="Textoennegrita"/>
+          <w:rFonts w:ascii="Lato" w:eastAsiaTheme="majorEastAsia" w:hAnsi="Lato"/>
+          <w:color w:val="273540"/>
+        </w:rPr>
+        <w:t>Consideraciones.</w:t>
+      </w:r>
+      <w:r>
+        <w:rPr>
+          <w:rStyle w:val="apple-converted-space"/>
+          <w:rFonts w:ascii="Lato" w:eastAsiaTheme="majorEastAsia" w:hAnsi="Lato"/>
           <w:b/>
           <w:bCs/>
-          <w:sz w:val="20"/>
-          <w:szCs w:val="20"/>
-          <w:lang w:val="es-ES_tradnl"/>
-        </w:rPr>
-      </w:pPr>
-      <w:r>
-        <w:rPr>
-          <w:rFonts w:ascii="Segoe UI" w:hAnsi="Segoe UI" w:cs="Segoe UI"/>
+          <w:color w:val="273540"/>
+        </w:rPr>
+        <w:t> </w:t>
+      </w:r>
+    </w:p>
+    <w:p>
+      <w:pPr>
+        <w:numPr>
+          <w:ilvl w:val="0"/>
+          <w:numId w:val="15"/>
+        </w:numPr>
+        <w:spacing w:before="100" w:beforeAutospacing="1" w:after="100" w:afterAutospacing="1"/>
+        <w:ind w:left="1095"/>
+        <w:rPr>
+          <w:rFonts w:ascii="Lato" w:hAnsi="Lato"/>
+          <w:color w:val="273540"/>
+        </w:rPr>
+      </w:pPr>
+      <w:r>
+        <w:rPr>
+          <w:rFonts w:ascii="Lato" w:hAnsi="Lato"/>
+          <w:color w:val="273540"/>
+        </w:rPr>
+        <w:t>La variable “no” es el identificador del indicador. No tomar en cuenta</w:t>
+      </w:r>
+      <w:r>
+        <w:rPr>
+          <w:rFonts w:ascii="Lato" w:hAnsi="Lato"/>
+          <w:color w:val="273540"/>
+        </w:rPr>
+        <w:t xml:space="preserve"> ya que todos los registros pertenecen al mismo indicador</w:t>
+      </w:r>
+      <w:r>
+        <w:rPr>
+          <w:rFonts w:ascii="Lato" w:hAnsi="Lato"/>
+          <w:color w:val="273540"/>
+        </w:rPr>
+        <w:t>.</w:t>
+      </w:r>
+    </w:p>
+    <w:p>
+      <w:pPr>
+        <w:numPr>
+          <w:ilvl w:val="0"/>
+          <w:numId w:val="15"/>
+        </w:numPr>
+        <w:spacing w:before="100" w:beforeAutospacing="1" w:after="100" w:afterAutospacing="1"/>
+        <w:ind w:left="1095"/>
+        <w:rPr>
+          <w:rFonts w:ascii="Lato" w:hAnsi="Lato"/>
+          <w:color w:val="273540"/>
+        </w:rPr>
+      </w:pPr>
+      <w:r>
+        <w:rPr>
+          <w:rFonts w:ascii="Lato" w:hAnsi="Lato"/>
+          <w:color w:val="273540"/>
+        </w:rPr>
+        <w:t>La variable “valor” es el número de personas proyectadas viviendo en cada estado en el año (“year”) especificado.</w:t>
+      </w:r>
+    </w:p>
+    <w:p>
+      <w:pPr>
+        <w:numPr>
+          <w:ilvl w:val="0"/>
+          <w:numId w:val="15"/>
+        </w:numPr>
+        <w:spacing w:before="100" w:beforeAutospacing="1" w:after="100" w:afterAutospacing="1"/>
+        <w:ind w:left="1095"/>
+        <w:rPr>
+          <w:rFonts w:ascii="Lato" w:hAnsi="Lato"/>
+          <w:color w:val="273540"/>
+        </w:rPr>
+      </w:pPr>
+      <w:r>
+        <w:rPr>
+          <w:rFonts w:ascii="Lato" w:hAnsi="Lato"/>
+          <w:color w:val="273540"/>
+        </w:rPr>
+        <w:t xml:space="preserve">Por contexto, se entiende lo que representan las demás variables. </w:t>
+      </w:r>
+    </w:p>
+    <w:p>
+      <w:pPr>
+        <w:jc w:val="both"/>
+        <w:rPr>
+          <w:rFonts w:ascii="Segoe UI" w:hAnsi="Segoe UI" w:cs="Segoe UI"/>
+          <w:sz w:val="20"/>
+          <w:szCs w:val="20"/>
+          <w:lang w:val="es-ES_tradnl"/>
+        </w:rPr>
+      </w:pPr>
+    </w:p>
+    <w:p>
+      <w:pPr>
+        <w:pStyle w:val="NormalWeb"/>
+        <w:spacing w:before="180" w:beforeAutospacing="0" w:after="180" w:afterAutospacing="0"/>
+        <w:rPr>
+          <w:rFonts w:ascii="Lato" w:hAnsi="Lato"/>
+          <w:color w:val="273540"/>
+        </w:rPr>
+      </w:pPr>
+      <w:r>
+        <w:rPr>
+          <w:rStyle w:val="Textoennegrita"/>
+          <w:rFonts w:ascii="Lato" w:eastAsiaTheme="majorEastAsia" w:hAnsi="Lato"/>
+          <w:color w:val="273540"/>
+        </w:rPr>
+        <w:t>Entregables:</w:t>
+      </w:r>
+      <w:r>
+        <w:rPr>
+          <w:rStyle w:val="apple-converted-space"/>
+          <w:rFonts w:ascii="Lato" w:eastAsiaTheme="majorEastAsia" w:hAnsi="Lato"/>
           <w:b/>
           <w:bCs/>
-          <w:sz w:val="20"/>
-          <w:szCs w:val="20"/>
-          <w:lang w:val="es-ES_tradnl"/>
-        </w:rPr>
-        <w:t xml:space="preserve">Entregables: </w:t>
-      </w:r>
-    </w:p>
-    <w:p>
-      <w:pPr>
-        <w:pStyle w:val="Prrafodelista"/>
+          <w:color w:val="273540"/>
+        </w:rPr>
+        <w:t> </w:t>
+      </w:r>
+    </w:p>
+    <w:p>
+      <w:pPr>
+        <w:pStyle w:val="NormalWeb"/>
+        <w:spacing w:before="180" w:beforeAutospacing="0" w:after="180" w:afterAutospacing="0"/>
+        <w:rPr>
+          <w:rFonts w:ascii="Lato" w:hAnsi="Lato"/>
+          <w:color w:val="273540"/>
+        </w:rPr>
+      </w:pPr>
+      <w:r>
+        <w:rPr>
+          <w:rFonts w:ascii="Lato" w:hAnsi="Lato"/>
+          <w:color w:val="273540"/>
+        </w:rPr>
+        <w:t>El entregable consistirá en un archivo comprimido *.zip o de una carpeta que contenga los siguientes archivos:</w:t>
+      </w:r>
+    </w:p>
+    <w:p>
+      <w:pPr>
         <w:numPr>
           <w:ilvl w:val="0"/>
-          <w:numId w:val="10"/>
+          <w:numId w:val="16"/>
         </w:numPr>
-        <w:jc w:val="both"/>
-        <w:rPr>
-          <w:rFonts w:ascii="Segoe UI" w:hAnsi="Segoe UI" w:cs="Segoe UI"/>
-          <w:sz w:val="20"/>
-          <w:szCs w:val="20"/>
-          <w:lang w:val="es-ES_tradnl"/>
-        </w:rPr>
-      </w:pPr>
-      <w:r>
-        <w:rPr>
-          <w:rFonts w:ascii="Segoe UI" w:hAnsi="Segoe UI" w:cs="Segoe UI"/>
-          <w:sz w:val="20"/>
-          <w:szCs w:val="20"/>
-          <w:lang w:val="es-ES_tradnl"/>
-        </w:rPr>
-        <w:t xml:space="preserve">Reporte con las respuestas a las preguntas del ejercicio 1, 2 y 3. </w:t>
-      </w:r>
-    </w:p>
-    <w:p>
-      <w:pPr>
-        <w:pStyle w:val="Prrafodelista"/>
+        <w:spacing w:before="100" w:beforeAutospacing="1" w:after="100" w:afterAutospacing="1"/>
+        <w:ind w:left="1095"/>
+        <w:rPr>
+          <w:rFonts w:ascii="Lato" w:hAnsi="Lato"/>
+          <w:color w:val="273540"/>
+        </w:rPr>
+      </w:pPr>
+      <w:r>
+        <w:rPr>
+          <w:rFonts w:ascii="Lato" w:hAnsi="Lato"/>
+          <w:color w:val="273540"/>
+        </w:rPr>
+        <w:t>Reporte, en Word o PDF, con las respuestas a las preguntas de los ejercicios 1, 2 y 3.</w:t>
+      </w:r>
+    </w:p>
+    <w:p>
+      <w:pPr>
         <w:numPr>
           <w:ilvl w:val="0"/>
-          <w:numId w:val="10"/>
+          <w:numId w:val="16"/>
         </w:numPr>
-        <w:jc w:val="both"/>
-        <w:rPr>
-          <w:rFonts w:ascii="Segoe UI" w:hAnsi="Segoe UI" w:cs="Segoe UI"/>
-          <w:sz w:val="20"/>
-          <w:szCs w:val="20"/>
-          <w:lang w:val="es-ES_tradnl"/>
-        </w:rPr>
-      </w:pPr>
-      <w:r>
-        <w:rPr>
-          <w:rFonts w:ascii="Segoe UI" w:hAnsi="Segoe UI" w:cs="Segoe UI"/>
-          <w:sz w:val="20"/>
-          <w:szCs w:val="20"/>
-          <w:lang w:val="es-ES_tradnl"/>
-        </w:rPr>
-        <w:t xml:space="preserve">Script del análisis de sentimientos del ejercicio 2. </w:t>
-      </w:r>
-    </w:p>
-    <w:p>
-      <w:pPr>
-        <w:pStyle w:val="Prrafodelista"/>
+        <w:spacing w:before="100" w:beforeAutospacing="1" w:after="100" w:afterAutospacing="1"/>
+        <w:ind w:left="1095"/>
+        <w:rPr>
+          <w:rFonts w:ascii="Lato" w:hAnsi="Lato"/>
+          <w:color w:val="273540"/>
+        </w:rPr>
+      </w:pPr>
+      <w:r>
+        <w:rPr>
+          <w:rFonts w:ascii="Lato" w:hAnsi="Lato"/>
+          <w:color w:val="273540"/>
+        </w:rPr>
+        <w:t>Script del análisis de sentimientos del ejercicio 2.</w:t>
+      </w:r>
+    </w:p>
+    <w:p>
+      <w:pPr>
         <w:numPr>
           <w:ilvl w:val="0"/>
-          <w:numId w:val="10"/>
+          <w:numId w:val="16"/>
         </w:numPr>
-        <w:jc w:val="both"/>
-        <w:rPr>
-          <w:rFonts w:ascii="Segoe UI" w:hAnsi="Segoe UI" w:cs="Segoe UI"/>
-          <w:sz w:val="20"/>
-          <w:szCs w:val="20"/>
-          <w:lang w:val="es-ES_tradnl"/>
-        </w:rPr>
-      </w:pPr>
-      <w:r>
-        <w:rPr>
-          <w:rFonts w:ascii="Segoe UI" w:hAnsi="Segoe UI" w:cs="Segoe UI"/>
-          <w:sz w:val="20"/>
-          <w:szCs w:val="20"/>
-          <w:lang w:val="es-ES_tradnl"/>
-        </w:rPr>
-        <w:t xml:space="preserve">Script del análisis del ejercicio 3. </w:t>
-      </w:r>
-    </w:p>
-    <w:p>
-      <w:pPr>
-        <w:jc w:val="both"/>
-        <w:rPr>
-          <w:rFonts w:ascii="Segoe UI" w:hAnsi="Segoe UI" w:cs="Segoe UI"/>
-          <w:sz w:val="20"/>
-          <w:szCs w:val="20"/>
-          <w:lang w:val="es-ES_tradnl"/>
-        </w:rPr>
-      </w:pPr>
-    </w:p>
-    <w:p>
-      <w:pPr>
-        <w:jc w:val="both"/>
-        <w:rPr>
-          <w:rFonts w:ascii="Segoe UI" w:hAnsi="Segoe UI" w:cs="Segoe UI"/>
+        <w:spacing w:before="100" w:beforeAutospacing="1" w:after="100" w:afterAutospacing="1"/>
+        <w:ind w:left="1095"/>
+        <w:rPr>
+          <w:rFonts w:ascii="Lato" w:hAnsi="Lato"/>
+          <w:color w:val="273540"/>
+        </w:rPr>
+      </w:pPr>
+      <w:r>
+        <w:rPr>
+          <w:rFonts w:ascii="Lato" w:hAnsi="Lato"/>
+          <w:color w:val="273540"/>
+        </w:rPr>
+        <w:t>Script del análisis del ejercicio 3.</w:t>
+      </w:r>
+    </w:p>
+    <w:p>
+      <w:pPr>
+        <w:numPr>
+          <w:ilvl w:val="0"/>
+          <w:numId w:val="16"/>
+        </w:numPr>
+        <w:spacing w:before="100" w:beforeAutospacing="1" w:after="100" w:afterAutospacing="1"/>
+        <w:ind w:left="1095"/>
+        <w:rPr>
+          <w:rFonts w:ascii="Lato" w:hAnsi="Lato"/>
+          <w:color w:val="273540"/>
+        </w:rPr>
+      </w:pPr>
+      <w:r>
+        <w:rPr>
+          <w:rFonts w:ascii="Lato" w:hAnsi="Lato"/>
+          <w:color w:val="273540"/>
+        </w:rPr>
+        <w:t>Archivo de proyecto *.Rproj para replicar los cálculos.</w:t>
+      </w:r>
+    </w:p>
+    <w:p>
+      <w:pPr>
+        <w:pStyle w:val="NormalWeb"/>
+        <w:spacing w:before="180" w:beforeAutospacing="0" w:after="180" w:afterAutospacing="0"/>
+        <w:rPr>
+          <w:rFonts w:ascii="Lato" w:hAnsi="Lato"/>
+          <w:color w:val="273540"/>
+        </w:rPr>
+      </w:pPr>
+      <w:r>
+        <w:rPr>
+          <w:rStyle w:val="Textoennegrita"/>
+          <w:rFonts w:ascii="Lato" w:eastAsiaTheme="majorEastAsia" w:hAnsi="Lato"/>
+          <w:color w:val="273540"/>
+        </w:rPr>
+        <w:t>Puntaje de los ejercicios:</w:t>
+      </w:r>
+      <w:r>
+        <w:rPr>
+          <w:rStyle w:val="apple-converted-space"/>
+          <w:rFonts w:ascii="Lato" w:eastAsiaTheme="majorEastAsia" w:hAnsi="Lato"/>
           <w:b/>
           <w:bCs/>
-          <w:sz w:val="20"/>
-          <w:szCs w:val="20"/>
-          <w:lang w:val="es-ES_tradnl"/>
-        </w:rPr>
-      </w:pPr>
-      <w:r>
+          <w:color w:val="273540"/>
+        </w:rPr>
+        <w:t> </w:t>
+      </w:r>
+    </w:p>
+    <w:p>
+      <w:pPr>
+        <w:numPr>
+          <w:ilvl w:val="0"/>
+          <w:numId w:val="17"/>
+        </w:numPr>
+        <w:spacing w:before="100" w:beforeAutospacing="1" w:after="100" w:afterAutospacing="1"/>
+        <w:ind w:left="1095"/>
+        <w:rPr>
+          <w:rFonts w:ascii="Lato" w:hAnsi="Lato"/>
+          <w:color w:val="273540"/>
+        </w:rPr>
+      </w:pPr>
+      <w:r>
+        <w:rPr>
+          <w:rFonts w:ascii="Lato" w:hAnsi="Lato"/>
+          <w:color w:val="273540"/>
+        </w:rPr>
+        <w:t>Ejercicio 1: 40%</w:t>
+      </w:r>
+    </w:p>
+    <w:p>
+      <w:pPr>
+        <w:numPr>
+          <w:ilvl w:val="0"/>
+          <w:numId w:val="17"/>
+        </w:numPr>
+        <w:spacing w:before="100" w:beforeAutospacing="1" w:after="100" w:afterAutospacing="1"/>
+        <w:ind w:left="1095"/>
+        <w:rPr>
+          <w:rFonts w:ascii="Lato" w:hAnsi="Lato"/>
+          <w:color w:val="273540"/>
+        </w:rPr>
+      </w:pPr>
+      <w:r>
+        <w:rPr>
+          <w:rFonts w:ascii="Lato" w:hAnsi="Lato"/>
+          <w:color w:val="273540"/>
+        </w:rPr>
+        <w:t>Ejercicio 2. 35%</w:t>
+      </w:r>
+    </w:p>
+    <w:p>
+      <w:pPr>
+        <w:numPr>
+          <w:ilvl w:val="0"/>
+          <w:numId w:val="17"/>
+        </w:numPr>
+        <w:spacing w:before="100" w:beforeAutospacing="1" w:after="100" w:afterAutospacing="1"/>
+        <w:ind w:left="1095"/>
+        <w:rPr>
+          <w:rFonts w:ascii="Lato" w:hAnsi="Lato"/>
+          <w:color w:val="273540"/>
+        </w:rPr>
+      </w:pPr>
+      <w:r>
+        <w:rPr>
+          <w:rFonts w:ascii="Lato" w:hAnsi="Lato"/>
+          <w:color w:val="273540"/>
+        </w:rPr>
+        <w:t>Ejercicio 3. 25%</w:t>
+      </w:r>
+    </w:p>
+    <w:p>
+      <w:pPr>
+        <w:jc w:val="both"/>
+        <w:rPr>
+          <w:rFonts w:ascii="Segoe UI" w:hAnsi="Segoe UI" w:cs="Segoe UI"/>
+          <w:sz w:val="20"/>
+          <w:szCs w:val="20"/>
+          <w:lang w:val="es-ES_tradnl"/>
+        </w:rPr>
+      </w:pPr>
+    </w:p>
+    <w:p>
+      <w:pPr>
+        <w:jc w:val="both"/>
         <w:rPr>
           <w:rFonts w:ascii="Segoe UI" w:hAnsi="Segoe UI" w:cs="Segoe UI"/>
           <w:b/>
@@ -3108,98 +3355,8 @@
           <w:szCs w:val="20"/>
           <w:lang w:val="es-ES_tradnl"/>
         </w:rPr>
-        <w:t xml:space="preserve">Puntaje de los ejercicios: </w:t>
-      </w:r>
-    </w:p>
-    <w:p>
-      <w:pPr>
-        <w:pStyle w:val="Prrafodelista"/>
-        <w:numPr>
-          <w:ilvl w:val="0"/>
-          <w:numId w:val="11"/>
-        </w:numPr>
-        <w:jc w:val="both"/>
-        <w:rPr>
-          <w:rFonts w:ascii="Segoe UI" w:hAnsi="Segoe UI" w:cs="Segoe UI"/>
-          <w:sz w:val="20"/>
-          <w:szCs w:val="20"/>
-          <w:lang w:val="es-ES_tradnl"/>
-        </w:rPr>
-      </w:pPr>
-      <w:r>
-        <w:rPr>
-          <w:rFonts w:ascii="Segoe UI" w:hAnsi="Segoe UI" w:cs="Segoe UI"/>
-          <w:sz w:val="20"/>
-          <w:szCs w:val="20"/>
-          <w:lang w:val="es-ES_tradnl"/>
-        </w:rPr>
-        <w:t>Ejercicio 1: 35%</w:t>
-      </w:r>
-    </w:p>
-    <w:p>
-      <w:pPr>
-        <w:pStyle w:val="Prrafodelista"/>
-        <w:numPr>
-          <w:ilvl w:val="0"/>
-          <w:numId w:val="11"/>
-        </w:numPr>
-        <w:jc w:val="both"/>
-        <w:rPr>
-          <w:rFonts w:ascii="Segoe UI" w:hAnsi="Segoe UI" w:cs="Segoe UI"/>
-          <w:sz w:val="20"/>
-          <w:szCs w:val="20"/>
-          <w:lang w:val="es-ES_tradnl"/>
-        </w:rPr>
-      </w:pPr>
-      <w:r>
-        <w:rPr>
-          <w:rFonts w:ascii="Segoe UI" w:hAnsi="Segoe UI" w:cs="Segoe UI"/>
-          <w:sz w:val="20"/>
-          <w:szCs w:val="20"/>
-          <w:lang w:val="es-ES_tradnl"/>
-        </w:rPr>
-        <w:t>Ejercicio 2. 40%</w:t>
-      </w:r>
-    </w:p>
-    <w:p>
-      <w:pPr>
-        <w:pStyle w:val="Prrafodelista"/>
-        <w:numPr>
-          <w:ilvl w:val="0"/>
-          <w:numId w:val="11"/>
-        </w:numPr>
-        <w:jc w:val="both"/>
-        <w:rPr>
-          <w:rFonts w:ascii="Segoe UI" w:hAnsi="Segoe UI" w:cs="Segoe UI"/>
-          <w:sz w:val="20"/>
-          <w:szCs w:val="20"/>
-          <w:lang w:val="es-ES_tradnl"/>
-        </w:rPr>
-      </w:pPr>
-      <w:r>
-        <w:rPr>
-          <w:rFonts w:ascii="Segoe UI" w:hAnsi="Segoe UI" w:cs="Segoe UI"/>
-          <w:sz w:val="20"/>
-          <w:szCs w:val="20"/>
-          <w:lang w:val="es-ES_tradnl"/>
-        </w:rPr>
-        <w:t>Ejercicio 3. 25%</w:t>
-      </w:r>
-    </w:p>
-    <w:p>
-      <w:pPr>
-        <w:jc w:val="both"/>
-        <w:rPr>
-          <w:rFonts w:ascii="Segoe UI" w:hAnsi="Segoe UI" w:cs="Segoe UI"/>
-          <w:sz w:val="20"/>
-          <w:szCs w:val="20"/>
-          <w:lang w:val="es-ES_tradnl"/>
-        </w:rPr>
-      </w:pPr>
-    </w:p>
-    <w:p>
-      <w:pPr>
-        <w:jc w:val="both"/>
+      </w:pPr>
+      <w:r>
         <w:rPr>
           <w:rFonts w:ascii="Segoe UI" w:hAnsi="Segoe UI" w:cs="Segoe UI"/>
           <w:b/>
@@ -3208,7 +3365,8 @@
           <w:szCs w:val="20"/>
           <w:lang w:val="es-ES_tradnl"/>
         </w:rPr>
-      </w:pPr>
+        <w:t>Fecha de entrega</w:t>
+      </w:r>
       <w:r>
         <w:rPr>
           <w:rFonts w:ascii="Segoe UI" w:hAnsi="Segoe UI" w:cs="Segoe UI"/>
@@ -3218,17 +3376,6 @@
           <w:szCs w:val="20"/>
           <w:lang w:val="es-ES_tradnl"/>
         </w:rPr>
-        <w:t>Fecha de entrega</w:t>
-      </w:r>
-      <w:r>
-        <w:rPr>
-          <w:rFonts w:ascii="Segoe UI" w:hAnsi="Segoe UI" w:cs="Segoe UI"/>
-          <w:b/>
-          <w:bCs/>
-          <w:sz w:val="20"/>
-          <w:szCs w:val="20"/>
-          <w:lang w:val="es-ES_tradnl"/>
-        </w:rPr>
         <w:t xml:space="preserve">: </w:t>
       </w:r>
       <w:r>
@@ -3238,7 +3385,16 @@
           <w:szCs w:val="20"/>
           <w:lang w:val="es-ES_tradnl"/>
         </w:rPr>
-        <w:t>3 de septiembre, 2025</w:t>
+        <w:t>5</w:t>
+      </w:r>
+      <w:r>
+        <w:rPr>
+          <w:rFonts w:ascii="Segoe UI" w:hAnsi="Segoe UI" w:cs="Segoe UI"/>
+          <w:sz w:val="20"/>
+          <w:szCs w:val="20"/>
+          <w:lang w:val="es-ES_tradnl"/>
+        </w:rPr>
+        <w:t xml:space="preserve"> de septiembre, 2025</w:t>
       </w:r>
     </w:p>
     <w:p>
@@ -3287,6 +3443,155 @@
 <file path=word/numbering.xml><?xml version="1.0" encoding="utf-8"?>
 <w:numbering xmlns:wpc="http://schemas.microsoft.com/office/word/2010/wordprocessingCanvas" xmlns:cx="http://schemas.microsoft.com/office/drawing/2014/chartex" xmlns:cx1="http://schemas.microsoft.com/office/drawing/2015/9/8/chartex" xmlns:cx2="http://schemas.microsoft.com/office/drawing/2015/10/21/chartex" xmlns:cx3="http://schemas.microsoft.com/office/drawing/2016/5/9/chartex" xmlns:cx4="http://schemas.microsoft.com/office/drawing/2016/5/10/chartex" xmlns:cx5="http://schemas.microsoft.com/office/drawing/2016/5/11/chartex" xmlns:cx6="http://schemas.microsoft.com/office/drawing/2016/5/12/chartex" xmlns:cx7="http://schemas.microsoft.com/office/drawing/2016/5/13/chartex" xmlns:cx8="http://schemas.microsoft.com/office/drawing/2016/5/14/chartex" xmlns:mc="http://schemas.openxmlformats.org/markup-compatibility/2006" xmlns:aink="http://schemas.microsoft.com/office/drawing/2016/ink" xmlns:am3d="http://schemas.microsoft.com/office/drawing/2017/model3d" xmlns:o="urn:schemas-microsoft-com:office:office" xmlns:oel="http://schemas.microsoft.com/office/2019/extlst" xmlns:r="http://schemas.openxmlformats.org/officeDocument/2006/relationships" xmlns:m="http://schemas.openxmlformats.org/officeDocument/2006/math" xmlns:v="urn:schemas-microsoft-com:vml" xmlns:wp14="http://schemas.microsoft.com/office/word/2010/wordprocessingDrawing" xmlns:wp="http://schemas.openxmlformats.org/drawingml/2006/wordprocessingDrawing" xmlns:w10="urn:schemas-microsoft-com:office:word" xmlns:w="http://schemas.openxmlformats.org/wordprocessingml/2006/main" xmlns:w14="http://schemas.microsoft.com/office/word/2010/wordml" xmlns:w15="http://schemas.microsoft.com/office/word/2012/wordml" xmlns:w16cex="http://schemas.microsoft.com/office/word/2018/wordml/cex" xmlns:w16cid="http://schemas.microsoft.com/office/word/2016/wordml/cid" xmlns:w16="http://schemas.microsoft.com/office/word/2018/wordml" xmlns:w16du="http://schemas.microsoft.com/office/word/2023/wordml/word16du" xmlns:w16sdtdh="http://schemas.microsoft.com/office/word/2020/wordml/sdtdatahash" xmlns:w16sdtfl="http://schemas.microsoft.com/office/word/2024/wordml/sdtformatlock" xmlns:w16se="http://schemas.microsoft.com/office/word/2015/wordml/symex" xmlns:wpg="http://schemas.microsoft.com/office/word/2010/wordprocessingGroup" xmlns:wpi="http://schemas.microsoft.com/office/word/2010/wordprocessingInk" xmlns:wne="http://schemas.microsoft.com/office/word/2006/wordml" xmlns:wps="http://schemas.microsoft.com/office/word/2010/wordprocessingShape" mc:Ignorable="w14 w15 w16se w16cid w16 w16cex w16sdtdh w16sdtfl w16du wp14">
   <w:abstractNum w:abstractNumId="0" w15:restartNumberingAfterBreak="0">
+    <w:nsid w:val="046E25F4"/>
+    <w:multiLevelType w:val="multilevel"/>
+    <w:tmpl w:val="671AB800"/>
+    <w:lvl w:ilvl="0">
+      <w:start w:val="1"/>
+      <w:numFmt w:val="bullet"/>
+      <w:lvlText w:val=""/>
+      <w:lvlJc w:val="left"/>
+      <w:pPr>
+        <w:tabs>
+          <w:tab w:val="num" w:pos="720"/>
+        </w:tabs>
+        <w:ind w:left="720" w:hanging="360"/>
+      </w:pPr>
+      <w:rPr>
+        <w:rFonts w:ascii="Symbol" w:hAnsi="Symbol" w:hint="default"/>
+        <w:sz w:val="20"/>
+      </w:rPr>
+    </w:lvl>
+    <w:lvl w:ilvl="1" w:tentative="1">
+      <w:start w:val="1"/>
+      <w:numFmt w:val="bullet"/>
+      <w:lvlText w:val="o"/>
+      <w:lvlJc w:val="left"/>
+      <w:pPr>
+        <w:tabs>
+          <w:tab w:val="num" w:pos="1440"/>
+        </w:tabs>
+        <w:ind w:left="1440" w:hanging="360"/>
+      </w:pPr>
+      <w:rPr>
+        <w:rFonts w:ascii="Courier New" w:hAnsi="Courier New" w:hint="default"/>
+        <w:sz w:val="20"/>
+      </w:rPr>
+    </w:lvl>
+    <w:lvl w:ilvl="2" w:tentative="1">
+      <w:start w:val="1"/>
+      <w:numFmt w:val="bullet"/>
+      <w:lvlText w:val=""/>
+      <w:lvlJc w:val="left"/>
+      <w:pPr>
+        <w:tabs>
+          <w:tab w:val="num" w:pos="2160"/>
+        </w:tabs>
+        <w:ind w:left="2160" w:hanging="360"/>
+      </w:pPr>
+      <w:rPr>
+        <w:rFonts w:ascii="Wingdings" w:hAnsi="Wingdings" w:hint="default"/>
+        <w:sz w:val="20"/>
+      </w:rPr>
+    </w:lvl>
+    <w:lvl w:ilvl="3" w:tentative="1">
+      <w:start w:val="1"/>
+      <w:numFmt w:val="bullet"/>
+      <w:lvlText w:val=""/>
+      <w:lvlJc w:val="left"/>
+      <w:pPr>
+        <w:tabs>
+          <w:tab w:val="num" w:pos="2880"/>
+        </w:tabs>
+        <w:ind w:left="2880" w:hanging="360"/>
+      </w:pPr>
+      <w:rPr>
+        <w:rFonts w:ascii="Wingdings" w:hAnsi="Wingdings" w:hint="default"/>
+        <w:sz w:val="20"/>
+      </w:rPr>
+    </w:lvl>
+    <w:lvl w:ilvl="4" w:tentative="1">
+      <w:start w:val="1"/>
+      <w:numFmt w:val="bullet"/>
+      <w:lvlText w:val=""/>
+      <w:lvlJc w:val="left"/>
+      <w:pPr>
+        <w:tabs>
+          <w:tab w:val="num" w:pos="3600"/>
+        </w:tabs>
+        <w:ind w:left="3600" w:hanging="360"/>
+      </w:pPr>
+      <w:rPr>
+        <w:rFonts w:ascii="Wingdings" w:hAnsi="Wingdings" w:hint="default"/>
+        <w:sz w:val="20"/>
+      </w:rPr>
+    </w:lvl>
+    <w:lvl w:ilvl="5" w:tentative="1">
+      <w:start w:val="1"/>
+      <w:numFmt w:val="bullet"/>
+      <w:lvlText w:val=""/>
+      <w:lvlJc w:val="left"/>
+      <w:pPr>
+        <w:tabs>
+          <w:tab w:val="num" w:pos="4320"/>
+        </w:tabs>
+        <w:ind w:left="4320" w:hanging="360"/>
+      </w:pPr>
+      <w:rPr>
+        <w:rFonts w:ascii="Wingdings" w:hAnsi="Wingdings" w:hint="default"/>
+        <w:sz w:val="20"/>
+      </w:rPr>
+    </w:lvl>
+    <w:lvl w:ilvl="6" w:tentative="1">
+      <w:start w:val="1"/>
+      <w:numFmt w:val="bullet"/>
+      <w:lvlText w:val=""/>
+      <w:lvlJc w:val="left"/>
+      <w:pPr>
+        <w:tabs>
+          <w:tab w:val="num" w:pos="5040"/>
+        </w:tabs>
+        <w:ind w:left="5040" w:hanging="360"/>
+      </w:pPr>
+      <w:rPr>
+        <w:rFonts w:ascii="Wingdings" w:hAnsi="Wingdings" w:hint="default"/>
+        <w:sz w:val="20"/>
+      </w:rPr>
+    </w:lvl>
+    <w:lvl w:ilvl="7" w:tentative="1">
+      <w:start w:val="1"/>
+      <w:numFmt w:val="bullet"/>
+      <w:lvlText w:val=""/>
+      <w:lvlJc w:val="left"/>
+      <w:pPr>
+        <w:tabs>
+          <w:tab w:val="num" w:pos="5760"/>
+        </w:tabs>
+        <w:ind w:left="5760" w:hanging="360"/>
+      </w:pPr>
+      <w:rPr>
+        <w:rFonts w:ascii="Wingdings" w:hAnsi="Wingdings" w:hint="default"/>
+        <w:sz w:val="20"/>
+      </w:rPr>
+    </w:lvl>
+    <w:lvl w:ilvl="8" w:tentative="1">
+      <w:start w:val="1"/>
+      <w:numFmt w:val="bullet"/>
+      <w:lvlText w:val=""/>
+      <w:lvlJc w:val="left"/>
+      <w:pPr>
+        <w:tabs>
+          <w:tab w:val="num" w:pos="6480"/>
+        </w:tabs>
+        <w:ind w:left="6480" w:hanging="360"/>
+      </w:pPr>
+      <w:rPr>
+        <w:rFonts w:ascii="Wingdings" w:hAnsi="Wingdings" w:hint="default"/>
+        <w:sz w:val="20"/>
+      </w:rPr>
+    </w:lvl>
+  </w:abstractNum>
+  <w:abstractNum w:abstractNumId="1" w15:restartNumberingAfterBreak="0">
     <w:nsid w:val="05623BA2"/>
     <w:multiLevelType w:val="hybridMultilevel"/>
     <w:tmpl w:val="A7C0DE64"/>
@@ -3375,7 +3680,7 @@
       </w:pPr>
     </w:lvl>
   </w:abstractNum>
-  <w:abstractNum w:abstractNumId="1" w15:restartNumberingAfterBreak="0">
+  <w:abstractNum w:abstractNumId="2" w15:restartNumberingAfterBreak="0">
     <w:nsid w:val="062D2F12"/>
     <w:multiLevelType w:val="hybridMultilevel"/>
     <w:tmpl w:val="E402A7AC"/>
@@ -3464,7 +3769,7 @@
       </w:pPr>
     </w:lvl>
   </w:abstractNum>
-  <w:abstractNum w:abstractNumId="2" w15:restartNumberingAfterBreak="0">
+  <w:abstractNum w:abstractNumId="3" w15:restartNumberingAfterBreak="0">
     <w:nsid w:val="07BC67EA"/>
     <w:multiLevelType w:val="hybridMultilevel"/>
     <w:tmpl w:val="3A206D52"/>
@@ -3553,7 +3858,7 @@
       </w:pPr>
     </w:lvl>
   </w:abstractNum>
-  <w:abstractNum w:abstractNumId="3" w15:restartNumberingAfterBreak="0">
+  <w:abstractNum w:abstractNumId="4" w15:restartNumberingAfterBreak="0">
     <w:nsid w:val="1BE2748F"/>
     <w:multiLevelType w:val="hybridMultilevel"/>
     <w:tmpl w:val="AED227D6"/>
@@ -3642,7 +3947,269 @@
       </w:pPr>
     </w:lvl>
   </w:abstractNum>
-  <w:abstractNum w:abstractNumId="4" w15:restartNumberingAfterBreak="0">
+  <w:abstractNum w:abstractNumId="5" w15:restartNumberingAfterBreak="0">
+    <w:nsid w:val="20DF3F54"/>
+    <w:multiLevelType w:val="multilevel"/>
+    <w:tmpl w:val="7D2C8C34"/>
+    <w:lvl w:ilvl="0">
+      <w:start w:val="1"/>
+      <w:numFmt w:val="decimal"/>
+      <w:lvlText w:val="%1."/>
+      <w:lvlJc w:val="left"/>
+      <w:pPr>
+        <w:tabs>
+          <w:tab w:val="num" w:pos="720"/>
+        </w:tabs>
+        <w:ind w:left="720" w:hanging="360"/>
+      </w:pPr>
+    </w:lvl>
+    <w:lvl w:ilvl="1" w:tentative="1">
+      <w:start w:val="1"/>
+      <w:numFmt w:val="decimal"/>
+      <w:lvlText w:val="%2."/>
+      <w:lvlJc w:val="left"/>
+      <w:pPr>
+        <w:tabs>
+          <w:tab w:val="num" w:pos="1440"/>
+        </w:tabs>
+        <w:ind w:left="1440" w:hanging="360"/>
+      </w:pPr>
+    </w:lvl>
+    <w:lvl w:ilvl="2" w:tentative="1">
+      <w:start w:val="1"/>
+      <w:numFmt w:val="decimal"/>
+      <w:lvlText w:val="%3."/>
+      <w:lvlJc w:val="left"/>
+      <w:pPr>
+        <w:tabs>
+          <w:tab w:val="num" w:pos="2160"/>
+        </w:tabs>
+        <w:ind w:left="2160" w:hanging="360"/>
+      </w:pPr>
+    </w:lvl>
+    <w:lvl w:ilvl="3" w:tentative="1">
+      <w:start w:val="1"/>
+      <w:numFmt w:val="decimal"/>
+      <w:lvlText w:val="%4."/>
+      <w:lvlJc w:val="left"/>
+      <w:pPr>
+        <w:tabs>
+          <w:tab w:val="num" w:pos="2880"/>
+        </w:tabs>
+        <w:ind w:left="2880" w:hanging="360"/>
+      </w:pPr>
+    </w:lvl>
+    <w:lvl w:ilvl="4" w:tentative="1">
+      <w:start w:val="1"/>
+      <w:numFmt w:val="decimal"/>
+      <w:lvlText w:val="%5."/>
+      <w:lvlJc w:val="left"/>
+      <w:pPr>
+        <w:tabs>
+          <w:tab w:val="num" w:pos="3600"/>
+        </w:tabs>
+        <w:ind w:left="3600" w:hanging="360"/>
+      </w:pPr>
+    </w:lvl>
+    <w:lvl w:ilvl="5" w:tentative="1">
+      <w:start w:val="1"/>
+      <w:numFmt w:val="decimal"/>
+      <w:lvlText w:val="%6."/>
+      <w:lvlJc w:val="left"/>
+      <w:pPr>
+        <w:tabs>
+          <w:tab w:val="num" w:pos="4320"/>
+        </w:tabs>
+        <w:ind w:left="4320" w:hanging="360"/>
+      </w:pPr>
+    </w:lvl>
+    <w:lvl w:ilvl="6" w:tentative="1">
+      <w:start w:val="1"/>
+      <w:numFmt w:val="decimal"/>
+      <w:lvlText w:val="%7."/>
+      <w:lvlJc w:val="left"/>
+      <w:pPr>
+        <w:tabs>
+          <w:tab w:val="num" w:pos="5040"/>
+        </w:tabs>
+        <w:ind w:left="5040" w:hanging="360"/>
+      </w:pPr>
+    </w:lvl>
+    <w:lvl w:ilvl="7" w:tentative="1">
+      <w:start w:val="1"/>
+      <w:numFmt w:val="decimal"/>
+      <w:lvlText w:val="%8."/>
+      <w:lvlJc w:val="left"/>
+      <w:pPr>
+        <w:tabs>
+          <w:tab w:val="num" w:pos="5760"/>
+        </w:tabs>
+        <w:ind w:left="5760" w:hanging="360"/>
+      </w:pPr>
+    </w:lvl>
+    <w:lvl w:ilvl="8" w:tentative="1">
+      <w:start w:val="1"/>
+      <w:numFmt w:val="decimal"/>
+      <w:lvlText w:val="%9."/>
+      <w:lvlJc w:val="left"/>
+      <w:pPr>
+        <w:tabs>
+          <w:tab w:val="num" w:pos="6480"/>
+        </w:tabs>
+        <w:ind w:left="6480" w:hanging="360"/>
+      </w:pPr>
+    </w:lvl>
+  </w:abstractNum>
+  <w:abstractNum w:abstractNumId="6" w15:restartNumberingAfterBreak="0">
+    <w:nsid w:val="24BA2ABD"/>
+    <w:multiLevelType w:val="multilevel"/>
+    <w:tmpl w:val="A68AA90A"/>
+    <w:lvl w:ilvl="0">
+      <w:start w:val="1"/>
+      <w:numFmt w:val="bullet"/>
+      <w:lvlText w:val=""/>
+      <w:lvlJc w:val="left"/>
+      <w:pPr>
+        <w:tabs>
+          <w:tab w:val="num" w:pos="720"/>
+        </w:tabs>
+        <w:ind w:left="720" w:hanging="360"/>
+      </w:pPr>
+      <w:rPr>
+        <w:rFonts w:ascii="Symbol" w:hAnsi="Symbol" w:hint="default"/>
+        <w:sz w:val="20"/>
+      </w:rPr>
+    </w:lvl>
+    <w:lvl w:ilvl="1" w:tentative="1">
+      <w:start w:val="1"/>
+      <w:numFmt w:val="bullet"/>
+      <w:lvlText w:val="o"/>
+      <w:lvlJc w:val="left"/>
+      <w:pPr>
+        <w:tabs>
+          <w:tab w:val="num" w:pos="1440"/>
+        </w:tabs>
+        <w:ind w:left="1440" w:hanging="360"/>
+      </w:pPr>
+      <w:rPr>
+        <w:rFonts w:ascii="Courier New" w:hAnsi="Courier New" w:hint="default"/>
+        <w:sz w:val="20"/>
+      </w:rPr>
+    </w:lvl>
+    <w:lvl w:ilvl="2" w:tentative="1">
+      <w:start w:val="1"/>
+      <w:numFmt w:val="bullet"/>
+      <w:lvlText w:val=""/>
+      <w:lvlJc w:val="left"/>
+      <w:pPr>
+        <w:tabs>
+          <w:tab w:val="num" w:pos="2160"/>
+        </w:tabs>
+        <w:ind w:left="2160" w:hanging="360"/>
+      </w:pPr>
+      <w:rPr>
+        <w:rFonts w:ascii="Wingdings" w:hAnsi="Wingdings" w:hint="default"/>
+        <w:sz w:val="20"/>
+      </w:rPr>
+    </w:lvl>
+    <w:lvl w:ilvl="3" w:tentative="1">
+      <w:start w:val="1"/>
+      <w:numFmt w:val="bullet"/>
+      <w:lvlText w:val=""/>
+      <w:lvlJc w:val="left"/>
+      <w:pPr>
+        <w:tabs>
+          <w:tab w:val="num" w:pos="2880"/>
+        </w:tabs>
+        <w:ind w:left="2880" w:hanging="360"/>
+      </w:pPr>
+      <w:rPr>
+        <w:rFonts w:ascii="Wingdings" w:hAnsi="Wingdings" w:hint="default"/>
+        <w:sz w:val="20"/>
+      </w:rPr>
+    </w:lvl>
+    <w:lvl w:ilvl="4" w:tentative="1">
+      <w:start w:val="1"/>
+      <w:numFmt w:val="bullet"/>
+      <w:lvlText w:val=""/>
+      <w:lvlJc w:val="left"/>
+      <w:pPr>
+        <w:tabs>
+          <w:tab w:val="num" w:pos="3600"/>
+        </w:tabs>
+        <w:ind w:left="3600" w:hanging="360"/>
+      </w:pPr>
+      <w:rPr>
+        <w:rFonts w:ascii="Wingdings" w:hAnsi="Wingdings" w:hint="default"/>
+        <w:sz w:val="20"/>
+      </w:rPr>
+    </w:lvl>
+    <w:lvl w:ilvl="5" w:tentative="1">
+      <w:start w:val="1"/>
+      <w:numFmt w:val="bullet"/>
+      <w:lvlText w:val=""/>
+      <w:lvlJc w:val="left"/>
+      <w:pPr>
+        <w:tabs>
+          <w:tab w:val="num" w:pos="4320"/>
+        </w:tabs>
+        <w:ind w:left="4320" w:hanging="360"/>
+      </w:pPr>
+      <w:rPr>
+        <w:rFonts w:ascii="Wingdings" w:hAnsi="Wingdings" w:hint="default"/>
+        <w:sz w:val="20"/>
+      </w:rPr>
+    </w:lvl>
+    <w:lvl w:ilvl="6" w:tentative="1">
+      <w:start w:val="1"/>
+      <w:numFmt w:val="bullet"/>
+      <w:lvlText w:val=""/>
+      <w:lvlJc w:val="left"/>
+      <w:pPr>
+        <w:tabs>
+          <w:tab w:val="num" w:pos="5040"/>
+        </w:tabs>
+        <w:ind w:left="5040" w:hanging="360"/>
+      </w:pPr>
+      <w:rPr>
+        <w:rFonts w:ascii="Wingdings" w:hAnsi="Wingdings" w:hint="default"/>
+        <w:sz w:val="20"/>
+      </w:rPr>
+    </w:lvl>
+    <w:lvl w:ilvl="7" w:tentative="1">
+      <w:start w:val="1"/>
+      <w:numFmt w:val="bullet"/>
+      <w:lvlText w:val=""/>
+      <w:lvlJc w:val="left"/>
+      <w:pPr>
+        <w:tabs>
+          <w:tab w:val="num" w:pos="5760"/>
+        </w:tabs>
+        <w:ind w:left="5760" w:hanging="360"/>
+      </w:pPr>
+      <w:rPr>
+        <w:rFonts w:ascii="Wingdings" w:hAnsi="Wingdings" w:hint="default"/>
+        <w:sz w:val="20"/>
+      </w:rPr>
+    </w:lvl>
+    <w:lvl w:ilvl="8" w:tentative="1">
+      <w:start w:val="1"/>
+      <w:numFmt w:val="bullet"/>
+      <w:lvlText w:val=""/>
+      <w:lvlJc w:val="left"/>
+      <w:pPr>
+        <w:tabs>
+          <w:tab w:val="num" w:pos="6480"/>
+        </w:tabs>
+        <w:ind w:left="6480" w:hanging="360"/>
+      </w:pPr>
+      <w:rPr>
+        <w:rFonts w:ascii="Wingdings" w:hAnsi="Wingdings" w:hint="default"/>
+        <w:sz w:val="20"/>
+      </w:rPr>
+    </w:lvl>
+  </w:abstractNum>
+  <w:abstractNum w:abstractNumId="7" w15:restartNumberingAfterBreak="0">
     <w:nsid w:val="271054C8"/>
     <w:multiLevelType w:val="hybridMultilevel"/>
     <w:tmpl w:val="34808852"/>
@@ -3731,7 +4298,7 @@
       </w:pPr>
     </w:lvl>
   </w:abstractNum>
-  <w:abstractNum w:abstractNumId="5" w15:restartNumberingAfterBreak="0">
+  <w:abstractNum w:abstractNumId="8" w15:restartNumberingAfterBreak="0">
     <w:nsid w:val="2FDD7FE3"/>
     <w:multiLevelType w:val="hybridMultilevel"/>
     <w:tmpl w:val="BA1A0C6C"/>
@@ -3820,7 +4387,7 @@
       </w:pPr>
     </w:lvl>
   </w:abstractNum>
-  <w:abstractNum w:abstractNumId="6" w15:restartNumberingAfterBreak="0">
+  <w:abstractNum w:abstractNumId="9" w15:restartNumberingAfterBreak="0">
     <w:nsid w:val="36563CAC"/>
     <w:multiLevelType w:val="hybridMultilevel"/>
     <w:tmpl w:val="6C80086A"/>
@@ -3909,7 +4476,120 @@
       </w:pPr>
     </w:lvl>
   </w:abstractNum>
-  <w:abstractNum w:abstractNumId="7" w15:restartNumberingAfterBreak="0">
+  <w:abstractNum w:abstractNumId="10" w15:restartNumberingAfterBreak="0">
+    <w:nsid w:val="43B36791"/>
+    <w:multiLevelType w:val="multilevel"/>
+    <w:tmpl w:val="C96018E0"/>
+    <w:lvl w:ilvl="0">
+      <w:start w:val="1"/>
+      <w:numFmt w:val="decimal"/>
+      <w:lvlText w:val="%1."/>
+      <w:lvlJc w:val="left"/>
+      <w:pPr>
+        <w:tabs>
+          <w:tab w:val="num" w:pos="720"/>
+        </w:tabs>
+        <w:ind w:left="720" w:hanging="360"/>
+      </w:pPr>
+    </w:lvl>
+    <w:lvl w:ilvl="1" w:tentative="1">
+      <w:start w:val="1"/>
+      <w:numFmt w:val="decimal"/>
+      <w:lvlText w:val="%2."/>
+      <w:lvlJc w:val="left"/>
+      <w:pPr>
+        <w:tabs>
+          <w:tab w:val="num" w:pos="1440"/>
+        </w:tabs>
+        <w:ind w:left="1440" w:hanging="360"/>
+      </w:pPr>
+    </w:lvl>
+    <w:lvl w:ilvl="2" w:tentative="1">
+      <w:start w:val="1"/>
+      <w:numFmt w:val="decimal"/>
+      <w:lvlText w:val="%3."/>
+      <w:lvlJc w:val="left"/>
+      <w:pPr>
+        <w:tabs>
+          <w:tab w:val="num" w:pos="2160"/>
+        </w:tabs>
+        <w:ind w:left="2160" w:hanging="360"/>
+      </w:pPr>
+    </w:lvl>
+    <w:lvl w:ilvl="3" w:tentative="1">
+      <w:start w:val="1"/>
+      <w:numFmt w:val="decimal"/>
+      <w:lvlText w:val="%4."/>
+      <w:lvlJc w:val="left"/>
+      <w:pPr>
+        <w:tabs>
+          <w:tab w:val="num" w:pos="2880"/>
+        </w:tabs>
+        <w:ind w:left="2880" w:hanging="360"/>
+      </w:pPr>
+    </w:lvl>
+    <w:lvl w:ilvl="4" w:tentative="1">
+      <w:start w:val="1"/>
+      <w:numFmt w:val="decimal"/>
+      <w:lvlText w:val="%5."/>
+      <w:lvlJc w:val="left"/>
+      <w:pPr>
+        <w:tabs>
+          <w:tab w:val="num" w:pos="3600"/>
+        </w:tabs>
+        <w:ind w:left="3600" w:hanging="360"/>
+      </w:pPr>
+    </w:lvl>
+    <w:lvl w:ilvl="5" w:tentative="1">
+      <w:start w:val="1"/>
+      <w:numFmt w:val="decimal"/>
+      <w:lvlText w:val="%6."/>
+      <w:lvlJc w:val="left"/>
+      <w:pPr>
+        <w:tabs>
+          <w:tab w:val="num" w:pos="4320"/>
+        </w:tabs>
+        <w:ind w:left="4320" w:hanging="360"/>
+      </w:pPr>
+    </w:lvl>
+    <w:lvl w:ilvl="6" w:tentative="1">
+      <w:start w:val="1"/>
+      <w:numFmt w:val="decimal"/>
+      <w:lvlText w:val="%7."/>
+      <w:lvlJc w:val="left"/>
+      <w:pPr>
+        <w:tabs>
+          <w:tab w:val="num" w:pos="5040"/>
+        </w:tabs>
+        <w:ind w:left="5040" w:hanging="360"/>
+      </w:pPr>
+    </w:lvl>
+    <w:lvl w:ilvl="7" w:tentative="1">
+      <w:start w:val="1"/>
+      <w:numFmt w:val="decimal"/>
+      <w:lvlText w:val="%8."/>
+      <w:lvlJc w:val="left"/>
+      <w:pPr>
+        <w:tabs>
+          <w:tab w:val="num" w:pos="5760"/>
+        </w:tabs>
+        <w:ind w:left="5760" w:hanging="360"/>
+      </w:pPr>
+    </w:lvl>
+    <w:lvl w:ilvl="8" w:tentative="1">
+      <w:start w:val="1"/>
+      <w:numFmt w:val="decimal"/>
+      <w:lvlText w:val="%9."/>
+      <w:lvlJc w:val="left"/>
+      <w:pPr>
+        <w:tabs>
+          <w:tab w:val="num" w:pos="6480"/>
+        </w:tabs>
+        <w:ind w:left="6480" w:hanging="360"/>
+      </w:pPr>
+    </w:lvl>
+  </w:abstractNum>
+  <w:abstractNum w:abstractNumId="11" w15:restartNumberingAfterBreak="0">
     <w:nsid w:val="458F4880"/>
     <w:multiLevelType w:val="hybridMultilevel"/>
     <w:tmpl w:val="5FC2189C"/>
@@ -3998,7 +4678,7 @@
       </w:pPr>
     </w:lvl>
   </w:abstractNum>
-  <w:abstractNum w:abstractNumId="8" w15:restartNumberingAfterBreak="0">
+  <w:abstractNum w:abstractNumId="12" w15:restartNumberingAfterBreak="0">
     <w:nsid w:val="4CFA5E66"/>
     <w:multiLevelType w:val="multilevel"/>
     <w:tmpl w:val="5CC0C33A"/>
@@ -4115,7 +4795,156 @@
       </w:pPr>
     </w:lvl>
   </w:abstractNum>
-  <w:abstractNum w:abstractNumId="9" w15:restartNumberingAfterBreak="0">
+  <w:abstractNum w:abstractNumId="13" w15:restartNumberingAfterBreak="0">
+    <w:nsid w:val="51C53507"/>
+    <w:multiLevelType w:val="multilevel"/>
+    <w:tmpl w:val="F7646ED2"/>
+    <w:lvl w:ilvl="0">
+      <w:start w:val="1"/>
+      <w:numFmt w:val="bullet"/>
+      <w:lvlText w:val=""/>
+      <w:lvlJc w:val="left"/>
+      <w:pPr>
+        <w:tabs>
+          <w:tab w:val="num" w:pos="720"/>
+        </w:tabs>
+        <w:ind w:left="720" w:hanging="360"/>
+      </w:pPr>
+      <w:rPr>
+        <w:rFonts w:ascii="Symbol" w:hAnsi="Symbol" w:hint="default"/>
+        <w:sz w:val="20"/>
+      </w:rPr>
+    </w:lvl>
+    <w:lvl w:ilvl="1" w:tentative="1">
+      <w:start w:val="1"/>
+      <w:numFmt w:val="bullet"/>
+      <w:lvlText w:val="o"/>
+      <w:lvlJc w:val="left"/>
+      <w:pPr>
+        <w:tabs>
+          <w:tab w:val="num" w:pos="1440"/>
+        </w:tabs>
+        <w:ind w:left="1440" w:hanging="360"/>
+      </w:pPr>
+      <w:rPr>
+        <w:rFonts w:ascii="Courier New" w:hAnsi="Courier New" w:hint="default"/>
+        <w:sz w:val="20"/>
+      </w:rPr>
+    </w:lvl>
+    <w:lvl w:ilvl="2" w:tentative="1">
+      <w:start w:val="1"/>
+      <w:numFmt w:val="bullet"/>
+      <w:lvlText w:val=""/>
+      <w:lvlJc w:val="left"/>
+      <w:pPr>
+        <w:tabs>
+          <w:tab w:val="num" w:pos="2160"/>
+        </w:tabs>
+        <w:ind w:left="2160" w:hanging="360"/>
+      </w:pPr>
+      <w:rPr>
+        <w:rFonts w:ascii="Wingdings" w:hAnsi="Wingdings" w:hint="default"/>
+        <w:sz w:val="20"/>
+      </w:rPr>
+    </w:lvl>
+    <w:lvl w:ilvl="3" w:tentative="1">
+      <w:start w:val="1"/>
+      <w:numFmt w:val="bullet"/>
+      <w:lvlText w:val=""/>
+      <w:lvlJc w:val="left"/>
+      <w:pPr>
+        <w:tabs>
+          <w:tab w:val="num" w:pos="2880"/>
+        </w:tabs>
+        <w:ind w:left="2880" w:hanging="360"/>
+      </w:pPr>
+      <w:rPr>
+        <w:rFonts w:ascii="Wingdings" w:hAnsi="Wingdings" w:hint="default"/>
+        <w:sz w:val="20"/>
+      </w:rPr>
+    </w:lvl>
+    <w:lvl w:ilvl="4" w:tentative="1">
+      <w:start w:val="1"/>
+      <w:numFmt w:val="bullet"/>
+      <w:lvlText w:val=""/>
+      <w:lvlJc w:val="left"/>
+      <w:pPr>
+        <w:tabs>
+          <w:tab w:val="num" w:pos="3600"/>
+        </w:tabs>
+        <w:ind w:left="3600" w:hanging="360"/>
+      </w:pPr>
+      <w:rPr>
+        <w:rFonts w:ascii="Wingdings" w:hAnsi="Wingdings" w:hint="default"/>
+        <w:sz w:val="20"/>
+      </w:rPr>
+    </w:lvl>
+    <w:lvl w:ilvl="5" w:tentative="1">
+      <w:start w:val="1"/>
+      <w:numFmt w:val="bullet"/>
+      <w:lvlText w:val=""/>
+      <w:lvlJc w:val="left"/>
+      <w:pPr>
+        <w:tabs>
+          <w:tab w:val="num" w:pos="4320"/>
+        </w:tabs>
+        <w:ind w:left="4320" w:hanging="360"/>
+      </w:pPr>
+      <w:rPr>
+        <w:rFonts w:ascii="Wingdings" w:hAnsi="Wingdings" w:hint="default"/>
+        <w:sz w:val="20"/>
+      </w:rPr>
+    </w:lvl>
+    <w:lvl w:ilvl="6" w:tentative="1">
+      <w:start w:val="1"/>
+      <w:numFmt w:val="bullet"/>
+      <w:lvlText w:val=""/>
+      <w:lvlJc w:val="left"/>
+      <w:pPr>
+        <w:tabs>
+          <w:tab w:val="num" w:pos="5040"/>
+        </w:tabs>
+        <w:ind w:left="5040" w:hanging="360"/>
+      </w:pPr>
+      <w:rPr>
+        <w:rFonts w:ascii="Wingdings" w:hAnsi="Wingdings" w:hint="default"/>
+        <w:sz w:val="20"/>
+      </w:rPr>
+    </w:lvl>
+    <w:lvl w:ilvl="7" w:tentative="1">
+      <w:start w:val="1"/>
+      <w:numFmt w:val="bullet"/>
+      <w:lvlText w:val=""/>
+      <w:lvlJc w:val="left"/>
+      <w:pPr>
+        <w:tabs>
+          <w:tab w:val="num" w:pos="5760"/>
+        </w:tabs>
+        <w:ind w:left="5760" w:hanging="360"/>
+      </w:pPr>
+      <w:rPr>
+        <w:rFonts w:ascii="Wingdings" w:hAnsi="Wingdings" w:hint="default"/>
+        <w:sz w:val="20"/>
+      </w:rPr>
+    </w:lvl>
+    <w:lvl w:ilvl="8" w:tentative="1">
+      <w:start w:val="1"/>
+      <w:numFmt w:val="bullet"/>
+      <w:lvlText w:val=""/>
+      <w:lvlJc w:val="left"/>
+      <w:pPr>
+        <w:tabs>
+          <w:tab w:val="num" w:pos="6480"/>
+        </w:tabs>
+        <w:ind w:left="6480" w:hanging="360"/>
+      </w:pPr>
+      <w:rPr>
+        <w:rFonts w:ascii="Wingdings" w:hAnsi="Wingdings" w:hint="default"/>
+        <w:sz w:val="20"/>
+      </w:rPr>
+    </w:lvl>
+  </w:abstractNum>
+  <w:abstractNum w:abstractNumId="14" w15:restartNumberingAfterBreak="0">
     <w:nsid w:val="530E0B46"/>
     <w:multiLevelType w:val="hybridMultilevel"/>
     <w:tmpl w:val="EF52AFF2"/>
@@ -4204,7 +5033,7 @@
       </w:pPr>
     </w:lvl>
   </w:abstractNum>
-  <w:abstractNum w:abstractNumId="10" w15:restartNumberingAfterBreak="0">
+  <w:abstractNum w:abstractNumId="15" w15:restartNumberingAfterBreak="0">
     <w:nsid w:val="5D3E50EA"/>
     <w:multiLevelType w:val="hybridMultilevel"/>
     <w:tmpl w:val="5170B47A"/>
@@ -4293,38 +5122,205 @@
       </w:pPr>
     </w:lvl>
   </w:abstractNum>
+  <w:abstractNum w:abstractNumId="16" w15:restartNumberingAfterBreak="0">
+    <w:nsid w:val="6ECF51C2"/>
+    <w:multiLevelType w:val="multilevel"/>
+    <w:tmpl w:val="67D27242"/>
+    <w:lvl w:ilvl="0">
+      <w:start w:val="1"/>
+      <w:numFmt w:val="bullet"/>
+      <w:lvlText w:val=""/>
+      <w:lvlJc w:val="left"/>
+      <w:pPr>
+        <w:tabs>
+          <w:tab w:val="num" w:pos="720"/>
+        </w:tabs>
+        <w:ind w:left="720" w:hanging="360"/>
+      </w:pPr>
+      <w:rPr>
+        <w:rFonts w:ascii="Symbol" w:hAnsi="Symbol" w:hint="default"/>
+        <w:sz w:val="20"/>
+      </w:rPr>
+    </w:lvl>
+    <w:lvl w:ilvl="1" w:tentative="1">
+      <w:start w:val="1"/>
+      <w:numFmt w:val="bullet"/>
+      <w:lvlText w:val="o"/>
+      <w:lvlJc w:val="left"/>
+      <w:pPr>
+        <w:tabs>
+          <w:tab w:val="num" w:pos="1440"/>
+        </w:tabs>
+        <w:ind w:left="1440" w:hanging="360"/>
+      </w:pPr>
+      <w:rPr>
+        <w:rFonts w:ascii="Courier New" w:hAnsi="Courier New" w:hint="default"/>
+        <w:sz w:val="20"/>
+      </w:rPr>
+    </w:lvl>
+    <w:lvl w:ilvl="2" w:tentative="1">
+      <w:start w:val="1"/>
+      <w:numFmt w:val="bullet"/>
+      <w:lvlText w:val=""/>
+      <w:lvlJc w:val="left"/>
+      <w:pPr>
+        <w:tabs>
+          <w:tab w:val="num" w:pos="2160"/>
+        </w:tabs>
+        <w:ind w:left="2160" w:hanging="360"/>
+      </w:pPr>
+      <w:rPr>
+        <w:rFonts w:ascii="Wingdings" w:hAnsi="Wingdings" w:hint="default"/>
+        <w:sz w:val="20"/>
+      </w:rPr>
+    </w:lvl>
+    <w:lvl w:ilvl="3" w:tentative="1">
+      <w:start w:val="1"/>
+      <w:numFmt w:val="bullet"/>
+      <w:lvlText w:val=""/>
+      <w:lvlJc w:val="left"/>
+      <w:pPr>
+        <w:tabs>
+          <w:tab w:val="num" w:pos="2880"/>
+        </w:tabs>
+        <w:ind w:left="2880" w:hanging="360"/>
+      </w:pPr>
+      <w:rPr>
+        <w:rFonts w:ascii="Wingdings" w:hAnsi="Wingdings" w:hint="default"/>
+        <w:sz w:val="20"/>
+      </w:rPr>
+    </w:lvl>
+    <w:lvl w:ilvl="4" w:tentative="1">
+      <w:start w:val="1"/>
+      <w:numFmt w:val="bullet"/>
+      <w:lvlText w:val=""/>
+      <w:lvlJc w:val="left"/>
+      <w:pPr>
+        <w:tabs>
+          <w:tab w:val="num" w:pos="3600"/>
+        </w:tabs>
+        <w:ind w:left="3600" w:hanging="360"/>
+      </w:pPr>
+      <w:rPr>
+        <w:rFonts w:ascii="Wingdings" w:hAnsi="Wingdings" w:hint="default"/>
+        <w:sz w:val="20"/>
+      </w:rPr>
+    </w:lvl>
+    <w:lvl w:ilvl="5" w:tentative="1">
+      <w:start w:val="1"/>
+      <w:numFmt w:val="bullet"/>
+      <w:lvlText w:val=""/>
+      <w:lvlJc w:val="left"/>
+      <w:pPr>
+        <w:tabs>
+          <w:tab w:val="num" w:pos="4320"/>
+        </w:tabs>
+        <w:ind w:left="4320" w:hanging="360"/>
+      </w:pPr>
+      <w:rPr>
+        <w:rFonts w:ascii="Wingdings" w:hAnsi="Wingdings" w:hint="default"/>
+        <w:sz w:val="20"/>
+      </w:rPr>
+    </w:lvl>
+    <w:lvl w:ilvl="6" w:tentative="1">
+      <w:start w:val="1"/>
+      <w:numFmt w:val="bullet"/>
+      <w:lvlText w:val=""/>
+      <w:lvlJc w:val="left"/>
+      <w:pPr>
+        <w:tabs>
+          <w:tab w:val="num" w:pos="5040"/>
+        </w:tabs>
+        <w:ind w:left="5040" w:hanging="360"/>
+      </w:pPr>
+      <w:rPr>
+        <w:rFonts w:ascii="Wingdings" w:hAnsi="Wingdings" w:hint="default"/>
+        <w:sz w:val="20"/>
+      </w:rPr>
+    </w:lvl>
+    <w:lvl w:ilvl="7" w:tentative="1">
+      <w:start w:val="1"/>
+      <w:numFmt w:val="bullet"/>
+      <w:lvlText w:val=""/>
+      <w:lvlJc w:val="left"/>
+      <w:pPr>
+        <w:tabs>
+          <w:tab w:val="num" w:pos="5760"/>
+        </w:tabs>
+        <w:ind w:left="5760" w:hanging="360"/>
+      </w:pPr>
+      <w:rPr>
+        <w:rFonts w:ascii="Wingdings" w:hAnsi="Wingdings" w:hint="default"/>
+        <w:sz w:val="20"/>
+      </w:rPr>
+    </w:lvl>
+    <w:lvl w:ilvl="8" w:tentative="1">
+      <w:start w:val="1"/>
+      <w:numFmt w:val="bullet"/>
+      <w:lvlText w:val=""/>
+      <w:lvlJc w:val="left"/>
+      <w:pPr>
+        <w:tabs>
+          <w:tab w:val="num" w:pos="6480"/>
+        </w:tabs>
+        <w:ind w:left="6480" w:hanging="360"/>
+      </w:pPr>
+      <w:rPr>
+        <w:rFonts w:ascii="Wingdings" w:hAnsi="Wingdings" w:hint="default"/>
+        <w:sz w:val="20"/>
+      </w:rPr>
+    </w:lvl>
+  </w:abstractNum>
   <w:num w:numId="1" w16cid:durableId="1313103129">
+    <w:abstractNumId w:val="1"/>
+  </w:num>
+  <w:num w:numId="2" w16cid:durableId="1710689879">
+    <w:abstractNumId w:val="4"/>
+  </w:num>
+  <w:num w:numId="3" w16cid:durableId="2064594000">
+    <w:abstractNumId w:val="15"/>
+  </w:num>
+  <w:num w:numId="4" w16cid:durableId="2006319361">
+    <w:abstractNumId w:val="11"/>
+  </w:num>
+  <w:num w:numId="5" w16cid:durableId="1218780921">
+    <w:abstractNumId w:val="14"/>
+  </w:num>
+  <w:num w:numId="6" w16cid:durableId="32273812">
+    <w:abstractNumId w:val="2"/>
+  </w:num>
+  <w:num w:numId="7" w16cid:durableId="757747043">
+    <w:abstractNumId w:val="7"/>
+  </w:num>
+  <w:num w:numId="8" w16cid:durableId="54397302">
+    <w:abstractNumId w:val="3"/>
+  </w:num>
+  <w:num w:numId="9" w16cid:durableId="455413548">
+    <w:abstractNumId w:val="12"/>
+  </w:num>
+  <w:num w:numId="10" w16cid:durableId="1997223099">
+    <w:abstractNumId w:val="9"/>
+  </w:num>
+  <w:num w:numId="11" w16cid:durableId="1732458031">
+    <w:abstractNumId w:val="8"/>
+  </w:num>
+  <w:num w:numId="12" w16cid:durableId="919212822">
+    <w:abstractNumId w:val="6"/>
+  </w:num>
+  <w:num w:numId="13" w16cid:durableId="1813326022">
+    <w:abstractNumId w:val="16"/>
+  </w:num>
+  <w:num w:numId="14" w16cid:durableId="665785964">
     <w:abstractNumId w:val="0"/>
   </w:num>
-  <w:num w:numId="2" w16cid:durableId="1710689879">
-    <w:abstractNumId w:val="3"/>
+  <w:num w:numId="15" w16cid:durableId="1835879165">
+    <w:abstractNumId w:val="13"/>
   </w:num>
-  <w:num w:numId="3" w16cid:durableId="2064594000">
+  <w:num w:numId="16" w16cid:durableId="617873539">
+    <w:abstractNumId w:val="5"/>
+  </w:num>
+  <w:num w:numId="17" w16cid:durableId="1526405726">
     <w:abstractNumId w:val="10"/>
-  </w:num>
-  <w:num w:numId="4" w16cid:durableId="2006319361">
-    <w:abstractNumId w:val="7"/>
-  </w:num>
-  <w:num w:numId="5" w16cid:durableId="1218780921">
-    <w:abstractNumId w:val="9"/>
-  </w:num>
-  <w:num w:numId="6" w16cid:durableId="32273812">
-    <w:abstractNumId w:val="1"/>
-  </w:num>
-  <w:num w:numId="7" w16cid:durableId="757747043">
-    <w:abstractNumId w:val="4"/>
-  </w:num>
-  <w:num w:numId="8" w16cid:durableId="54397302">
-    <w:abstractNumId w:val="2"/>
-  </w:num>
-  <w:num w:numId="9" w16cid:durableId="455413548">
-    <w:abstractNumId w:val="8"/>
-  </w:num>
-  <w:num w:numId="10" w16cid:durableId="1997223099">
-    <w:abstractNumId w:val="6"/>
-  </w:num>
-  <w:num w:numId="11" w16cid:durableId="1732458031">
-    <w:abstractNumId w:val="5"/>
   </w:num>
 </w:numbering>
 </file>

</xml_diff>